<commit_message>
Add structured generation privacy gate and macOS artifact
</commit_message>
<xml_diff>
--- a/Samples/Generated/Cours-complet-demo.docx
+++ b/Samples/Generated/Cours-complet-demo.docx
@@ -1,6 +1,6 @@
 
 <file path=word/document.xml><?xml version="1.0" encoding="utf-8"?>
-<w:document xmlns:w="http://schemas.openxmlformats.org/wordprocessingml/2006/main" xmlns:r="http://schemas.openxmlformats.org/officeDocument/2006/relationships">
+<w:document xmlns:w="http://schemas.openxmlformats.org/wordprocessingml/2006/main" xmlns:r="http://schemas.openxmlformats.org/officeDocument/2006/relationships" xmlns:wp="http://schemas.openxmlformats.org/drawingml/2006/wordprocessingDrawing" xmlns:a="http://schemas.openxmlformats.org/drawingml/2006/main" xmlns:pic="http://schemas.openxmlformats.org/drawingml/2006/picture">
   <w:body>
     <w:p>
       <w:pPr>
@@ -109,8 +109,83 @@
         <w:pStyle w:val="Heading1"/>
       </w:pPr>
       <w:r>
+        <w:t xml:space="preserve">Sommaire</w:t>
+      </w:r>
+    </w:p>
+    <w:p>
+      <w:pPr>
+        <w:pStyle w:val="TOC1"/>
+      </w:pPr>
+      <w:hyperlink w:anchor="section_1" w:history="1">
+        <w:r>
+          <w:rPr>
+            <w:rStyle w:val="Hyperlink"/>
+          </w:rPr>
+          <w:t>Objectifs du cours</w:t>
+        </w:r>
+      </w:hyperlink>
+    </w:p>
+    <w:p>
+      <w:pPr>
+        <w:pStyle w:val="TOC1"/>
+      </w:pPr>
+      <w:hyperlink w:anchor="section_2" w:history="1">
+        <w:r>
+          <w:rPr>
+            <w:rStyle w:val="Hyperlink"/>
+          </w:rPr>
+          <w:t>1. Organisation générale</w:t>
+        </w:r>
+      </w:hyperlink>
+    </w:p>
+    <w:p>
+      <w:pPr>
+        <w:pStyle w:val="TOC1"/>
+      </w:pPr>
+      <w:hyperlink w:anchor="section_3" w:history="1">
+        <w:r>
+          <w:rPr>
+            <w:rStyle w:val="Hyperlink"/>
+          </w:rPr>
+          <w:t>2. De la cellule au tissu</w:t>
+        </w:r>
+      </w:hyperlink>
+    </w:p>
+    <w:p>
+      <w:pPr>
+        <w:pStyle w:val="TOC1"/>
+      </w:pPr>
+      <w:hyperlink w:anchor="section_4" w:history="1">
+        <w:r>
+          <w:rPr>
+            <w:rStyle w:val="Hyperlink"/>
+          </w:rPr>
+          <w:t>3. Contrôle scientifique</w:t>
+        </w:r>
+      </w:hyperlink>
+    </w:p>
+    <w:p>
+      <w:pPr>
+        <w:pStyle w:val="TOC1"/>
+      </w:pPr>
+      <w:hyperlink w:anchor="sources" w:history="1">
+        <w:r>
+          <w:rPr>
+            <w:rStyle w:val="Hyperlink"/>
+          </w:rPr>
+          <w:t>Sources et vérifications</w:t>
+        </w:r>
+      </w:hyperlink>
+    </w:p>
+    <w:p>
+      <w:pPr>
+        <w:pStyle w:val="Heading1"/>
+      </w:pPr>
+      <w:bookmarkStart w:id="1" w:name="section_1"/>
+      <w:r>
         <w:t xml:space="preserve">Objectifs du cours</w:t>
       </w:r>
+      <w:bookmarkEnd w:id="1"/>
     </w:p>
     <w:p>
       <w:pPr>
@@ -152,9 +227,11 @@
       <w:pPr>
         <w:pStyle w:val="Heading1"/>
       </w:pPr>
+      <w:bookmarkStart w:id="2" w:name="section_2"/>
       <w:r>
         <w:t xml:space="preserve">1. Organisation générale</w:t>
       </w:r>
+      <w:bookmarkEnd w:id="2"/>
     </w:p>
     <w:p>
       <w:pPr>
@@ -182,8 +259,6 @@
           <w:left w:val="single" w:sz="18" w:color="9B1C1C"/>
           <w:bottom w:val="single" w:sz="8" w:color="9B1C1C"/>
           <w:right w:val="single" w:sz="8" w:color="9B1C1C"/>
-          <w:insideH w:val="none"/>
-          <w:insideV w:val="none"/>
         </w:tblBorders>
         <w:tblCellMar>
           <w:top w:w="120" w:type="dxa"/>
@@ -196,55 +271,209 @@
         <w:gridCol w:w="9360"/>
       </w:tblGrid>
       <w:tr>
+        <w:trPr>
+          <w:tblHeader/>
+        </w:trPr>
         <w:tc>
           <w:tcPr>
             <w:tcW w:w="9360" w:type="dxa"/>
-            <w:shd w:val="clear" w:color="auto" w:fill="FDECEC"/>
-          </w:tcPr>
-          <w:p>
-            <w:pPr>
-              <w:spacing w:before="0" w:after="60"/>
-            </w:pPr>
+            <w:shd w:val="clear" w:fill="FDECEC"/>
+          </w:tcPr>
+          <w:p>
+            <w:hyperlink r:id="rId4">
+              <w:r>
+                <w:rPr>
+                  <w:b/>
+                  <w:color w:val="9B1C1C"/>
+                </w:rPr>
+                <w:t>Information médicale importante à vérifier — Audio 12:22</w:t>
+              </w:r>
+            </w:hyperlink>
+          </w:p>
+          <w:p>
+            <w:r>
+              <w:t xml:space="preserve">Ce bloc démontre le signalement visuel d'une information sensible. Le texte est fictif ; aucune conduite clinique ne doit en être déduite.</w:t>
+            </w:r>
+          </w:p>
+        </w:tc>
+      </w:tr>
+    </w:tbl>
+    <w:p/>
+    <w:p>
+      <w:pPr>
+        <w:pStyle w:val="Heading1"/>
+      </w:pPr>
+      <w:bookmarkStart w:id="3" w:name="section_3"/>
+      <w:r>
+        <w:t xml:space="preserve">2. De la cellule au tissu</w:t>
+      </w:r>
+      <w:bookmarkEnd w:id="3"/>
+    </w:p>
+    <w:p>
+      <w:pPr>
+        <w:pStyle w:val="Normal"/>
+      </w:pPr>
+      <w:r>
+        <w:t xml:space="preserve">Le document peut regrouper les explications successives tout en conservant une formulation fidèle à la transcription validée.</w:t>
+      </w:r>
+    </w:p>
+    <w:p>
+      <w:pPr>
+        <w:pStyle w:val="TableCaption"/>
+      </w:pPr>
+      <w:r>
+        <w:t xml:space="preserve">Exemple de synthèse structurée</w:t>
+      </w:r>
+    </w:p>
+    <w:tbl>
+      <w:tblPr>
+        <w:tblW w:w="9360" w:type="dxa"/>
+        <w:tblInd w:w="120" w:type="dxa"/>
+        <w:tblLayout w:type="fixed"/>
+        <w:tblBorders>
+          <w:top w:val="single" w:sz="6" w:color="B8C2D1"/>
+          <w:left w:val="single" w:sz="6" w:color="B8C2D1"/>
+          <w:bottom w:val="single" w:sz="6" w:color="B8C2D1"/>
+          <w:right w:val="single" w:sz="6" w:color="B8C2D1"/>
+          <w:insideH w:val="single" w:sz="4" w:color="D8DEE8"/>
+          <w:insideV w:val="single" w:sz="4" w:color="D8DEE8"/>
+        </w:tblBorders>
+        <w:tblCellMar>
+          <w:top w:w="80" w:type="dxa"/>
+          <w:left w:w="120" w:type="dxa"/>
+          <w:bottom w:w="80" w:type="dxa"/>
+          <w:right w:w="120" w:type="dxa"/>
+        </w:tblCellMar>
+      </w:tblPr>
+      <w:tblGrid>
+        <w:gridCol w:w="1560"/>
+        <w:gridCol w:w="3120"/>
+        <w:gridCol w:w="4680"/>
+      </w:tblGrid>
+      <w:tr>
+        <w:trPr>
+          <w:tblHeader/>
+        </w:trPr>
+        <w:tc>
+          <w:tcPr>
+            <w:tcW w:w="1560" w:type="dxa"/>
+            <w:vAlign w:val="center"/>
+            <w:shd w:val="clear" w:fill="EAF0FF"/>
+          </w:tcPr>
+          <w:p>
             <w:r>
               <w:rPr>
                 <w:b/>
-                <w:color w:val="9B1C1C"/>
               </w:rPr>
-              <w:t>Information médicale importante à vérifier - Audio 12:22</w:t>
-            </w:r>
-          </w:p>
-          <w:p>
-            <w:pPr>
-              <w:spacing w:before="0" w:after="0" w:line="300" w:lineRule="auto"/>
-            </w:pPr>
-            <w:r>
-              <w:t xml:space="preserve">Ce bloc démontre le signalement visuel d'une information sensible. Le texte est fictif ; aucune conduite clinique ne doit en être déduite.</w:t>
+              <w:t xml:space="preserve">Niveau</w:t>
+            </w:r>
+          </w:p>
+        </w:tc>
+        <w:tc>
+          <w:tcPr>
+            <w:tcW w:w="3120" w:type="dxa"/>
+            <w:vAlign w:val="center"/>
+            <w:shd w:val="clear" w:fill="EAF0FF"/>
+          </w:tcPr>
+          <w:p>
+            <w:r>
+              <w:rPr>
+                <w:b/>
+              </w:rPr>
+              <w:t xml:space="preserve">Exemple</w:t>
+            </w:r>
+          </w:p>
+        </w:tc>
+        <w:tc>
+          <w:tcPr>
+            <w:tcW w:w="4680" w:type="dxa"/>
+            <w:vAlign w:val="center"/>
+            <w:shd w:val="clear" w:fill="EAF0FF"/>
+          </w:tcPr>
+          <w:p>
+            <w:r>
+              <w:rPr>
+                <w:b/>
+              </w:rPr>
+              <w:t xml:space="preserve">Fonction dans le cours</w:t>
+            </w:r>
+          </w:p>
+        </w:tc>
+      </w:tr>
+      <w:tr>
+        <w:trPr/>
+        <w:tc>
+          <w:tcPr>
+            <w:tcW w:w="1560" w:type="dxa"/>
+            <w:vAlign w:val="center"/>
+          </w:tcPr>
+          <w:p>
+            <w:r>
+              <w:t xml:space="preserve">Cellule</w:t>
+            </w:r>
+          </w:p>
+        </w:tc>
+        <w:tc>
+          <w:tcPr>
+            <w:tcW w:w="3120" w:type="dxa"/>
+            <w:vAlign w:val="center"/>
+          </w:tcPr>
+          <w:p>
+            <w:r>
+              <w:t xml:space="preserve">Cellule épithéliale</w:t>
+            </w:r>
+          </w:p>
+        </w:tc>
+        <w:tc>
+          <w:tcPr>
+            <w:tcW w:w="4680" w:type="dxa"/>
+            <w:vAlign w:val="center"/>
+          </w:tcPr>
+          <w:p>
+            <w:r>
+              <w:t xml:space="preserve">Unité de base</w:t>
+            </w:r>
+          </w:p>
+        </w:tc>
+      </w:tr>
+      <w:tr>
+        <w:trPr/>
+        <w:tc>
+          <w:tcPr>
+            <w:tcW w:w="1560" w:type="dxa"/>
+            <w:vAlign w:val="center"/>
+          </w:tcPr>
+          <w:p>
+            <w:r>
+              <w:t xml:space="preserve">Tissu</w:t>
+            </w:r>
+          </w:p>
+        </w:tc>
+        <w:tc>
+          <w:tcPr>
+            <w:tcW w:w="3120" w:type="dxa"/>
+            <w:vAlign w:val="center"/>
+          </w:tcPr>
+          <w:p>
+            <w:r>
+              <w:t xml:space="preserve">Épithélium</w:t>
+            </w:r>
+          </w:p>
+        </w:tc>
+        <w:tc>
+          <w:tcPr>
+            <w:tcW w:w="4680" w:type="dxa"/>
+            <w:vAlign w:val="center"/>
+          </w:tcPr>
+          <w:p>
+            <w:r>
+              <w:t xml:space="preserve">Organisation de cellules</w:t>
             </w:r>
           </w:p>
         </w:tc>
       </w:tr>
     </w:tbl>
-    <w:p>
-      <w:pPr>
-        <w:spacing w:before="0" w:after="80"/>
-      </w:pPr>
-    </w:p>
-    <w:p>
-      <w:pPr>
-        <w:pStyle w:val="Heading1"/>
-      </w:pPr>
-      <w:r>
-        <w:t xml:space="preserve">2. De la cellule au tissu</w:t>
-      </w:r>
-    </w:p>
-    <w:p>
-      <w:pPr>
-        <w:pStyle w:val="Normal"/>
-      </w:pPr>
-      <w:r>
-        <w:t xml:space="preserve">Le document peut regrouper les explications successives tout en conservant une formulation fidèle à la transcription validée.</w:t>
-      </w:r>
-    </w:p>
+    <w:p/>
     <w:p>
       <w:pPr>
         <w:pStyle w:val="ListBullet"/>
@@ -291,8 +520,6 @@
           <w:left w:val="single" w:sz="18" w:color="7A5A00"/>
           <w:bottom w:val="single" w:sz="8" w:color="7A5A00"/>
           <w:right w:val="single" w:sz="8" w:color="7A5A00"/>
-          <w:insideH w:val="none"/>
-          <w:insideV w:val="none"/>
         </w:tblBorders>
         <w:tblCellMar>
           <w:top w:w="120" w:type="dxa"/>
@@ -305,27 +532,26 @@
         <w:gridCol w:w="9360"/>
       </w:tblGrid>
       <w:tr>
+        <w:trPr>
+          <w:tblHeader/>
+        </w:trPr>
         <w:tc>
           <w:tcPr>
             <w:tcW w:w="9360" w:type="dxa"/>
-            <w:shd w:val="clear" w:color="auto" w:fill="FFF8E1"/>
-          </w:tcPr>
-          <w:p>
-            <w:pPr>
-              <w:spacing w:before="0" w:after="60"/>
-            </w:pPr>
-            <w:r>
-              <w:rPr>
-                <w:b/>
-                <w:color w:val="7A5A00"/>
-              </w:rPr>
-              <w:t>Passage incertain - Audio 17:14</w:t>
-            </w:r>
-          </w:p>
-          <w:p>
-            <w:pPr>
-              <w:spacing w:before="0" w:after="0" w:line="300" w:lineRule="auto"/>
-            </w:pPr>
+            <w:shd w:val="clear" w:fill="FFF8E1"/>
+          </w:tcPr>
+          <w:p>
+            <w:hyperlink r:id="rId5">
+              <w:r>
+                <w:rPr>
+                  <w:b/>
+                  <w:color w:val="7A5A00"/>
+                </w:rPr>
+                <w:t>Passage incertain — Audio 17:14</w:t>
+              </w:r>
+            </w:hyperlink>
+          </w:p>
+          <w:p>
             <w:r>
               <w:t xml:space="preserve">Le terme entendu dans l'enregistrement doit être confirmé avant la validation du document final.</w:t>
             </w:r>
@@ -333,18 +559,16 @@
         </w:tc>
       </w:tr>
     </w:tbl>
-    <w:p>
-      <w:pPr>
-        <w:spacing w:before="0" w:after="80"/>
-      </w:pPr>
-    </w:p>
+    <w:p/>
     <w:p>
       <w:pPr>
         <w:pStyle w:val="Heading1"/>
       </w:pPr>
+      <w:bookmarkStart w:id="4" w:name="section_4"/>
       <w:r>
         <w:t xml:space="preserve">3. Contrôle scientifique</w:t>
       </w:r>
+      <w:bookmarkEnd w:id="4"/>
     </w:p>
     <w:p>
       <w:pPr>
@@ -364,8 +588,6 @@
           <w:left w:val="single" w:sz="18" w:color="276749"/>
           <w:bottom w:val="single" w:sz="8" w:color="276749"/>
           <w:right w:val="single" w:sz="8" w:color="276749"/>
-          <w:insideH w:val="none"/>
-          <w:insideV w:val="none"/>
         </w:tblBorders>
         <w:tblCellMar>
           <w:top w:w="120" w:type="dxa"/>
@@ -378,15 +600,15 @@
         <w:gridCol w:w="9360"/>
       </w:tblGrid>
       <w:tr>
+        <w:trPr>
+          <w:tblHeader/>
+        </w:trPr>
         <w:tc>
           <w:tcPr>
             <w:tcW w:w="9360" w:type="dxa"/>
-            <w:shd w:val="clear" w:color="auto" w:fill="EAF4EE"/>
-          </w:tcPr>
-          <w:p>
-            <w:pPr>
-              <w:spacing w:before="0" w:after="60"/>
-            </w:pPr>
+            <w:shd w:val="clear" w:fill="EAF4EE"/>
+          </w:tcPr>
+          <w:p>
             <w:r>
               <w:rPr>
                 <w:b/>
@@ -396,9 +618,6 @@
             </w:r>
           </w:p>
           <w:p>
-            <w:pPr>
-              <w:spacing w:before="0" w:after="0" w:line="300" w:lineRule="auto"/>
-            </w:pPr>
             <w:r>
               <w:t xml:space="preserve">Cet encadré teste uniquement le style du document. Il ne contient aucune recommandation clinique.</w:t>
             </w:r>
@@ -406,18 +625,16 @@
         </w:tc>
       </w:tr>
     </w:tbl>
-    <w:p>
-      <w:pPr>
-        <w:spacing w:before="0" w:after="80"/>
-      </w:pPr>
-    </w:p>
+    <w:p/>
     <w:p>
       <w:pPr>
         <w:pStyle w:val="Heading1"/>
       </w:pPr>
+      <w:bookmarkStart w:id="5" w:name="sources"/>
       <w:r>
         <w:t xml:space="preserve">Sources et vérifications</w:t>
       </w:r>
+      <w:bookmarkEnd w:id="5"/>
     </w:p>
     <w:p>
       <w:pPr>
@@ -427,7 +644,7 @@
         <w:rPr>
           <w:b/>
         </w:rPr>
-        <w:t>Organisation mondiale de la Santé (démonstration du format) - </w:t>
+        <w:t>Organisation mondiale de la Santé (démonstration du format) — </w:t>
       </w:r>
       <w:hyperlink r:id="rId3">
         <w:r>
@@ -444,8 +661,8 @@
     <w:sectPr>
       <w:headerReference w:type="default" r:id="rId1"/>
       <w:footerReference w:type="default" r:id="rId2"/>
-      <w:pgSz w:w="12240" w:h="15840"/>
-      <w:pgMar w:top="1440" w:right="1440" w:bottom="1440" w:left="1440" w:header="708" w:footer="708" w:gutter="0"/>
+      <w:pgSz w:w="11906" w:h="16838"/>
+      <w:pgMar w:top="1273" w:right="1273" w:bottom="1273" w:left="1273" w:header="708" w:footer="708" w:gutter="0"/>
       <w:cols w:space="708"/>
       <w:docGrid w:linePitch="360"/>
     </w:sectPr>
@@ -460,7 +677,7 @@
       <w:pStyle w:val="Footer"/>
     </w:pPr>
     <w:r>
-      <w:t xml:space="preserve">Scrib  ·  Page </w:t>
+      <w:t xml:space="preserve">Scrib · Page </w:t>
     </w:r>
     <w:fldSimple w:instr="PAGE">
       <w:r>
@@ -478,7 +695,7 @@
       <w:pStyle w:val="Header"/>
     </w:pPr>
     <w:r>
-      <w:t>SCRIB  ·  La cellule et les tissus</w:t>
+      <w:t>SCRIB · La cellule et les tissus</w:t>
     </w:r>
   </w:p>
 </w:hdr>
@@ -494,15 +711,8 @@
       <w:lvlText w:val="•"/>
       <w:lvlJc w:val="left"/>
       <w:pPr>
-        <w:tabs>
-          <w:tab w:val="num" w:pos="540"/>
-        </w:tabs>
-        <w:spacing w:after="80" w:line="300" w:lineRule="auto"/>
         <w:ind w:left="540" w:hanging="270"/>
       </w:pPr>
-      <w:rPr>
-        <w:rFonts w:ascii="Arial" w:hAnsi="Arial"/>
-      </w:rPr>
     </w:lvl>
   </w:abstractNum>
   <w:num w:numId="1">
@@ -516,9 +726,8 @@
   <w:docDefaults>
     <w:rPrDefault>
       <w:rPr>
-        <w:rFonts w:ascii="Calibri" w:hAnsi="Calibri" w:eastAsia="Calibri"/>
+        <w:rFonts w:ascii="Calibri" w:hAnsi="Calibri"/>
         <w:sz w:val="22"/>
-        <w:szCs w:val="22"/>
         <w:lang w:val="fr-FR"/>
       </w:rPr>
     </w:rPrDefault>
@@ -531,39 +740,29 @@
   <w:style w:type="paragraph" w:default="1" w:styleId="Normal">
     <w:name w:val="Normal"/>
     <w:qFormat/>
-    <w:pPr>
-      <w:spacing w:before="0" w:after="120" w:line="300" w:lineRule="auto"/>
-    </w:pPr>
-    <w:rPr>
-      <w:rFonts w:ascii="Calibri" w:hAnsi="Calibri"/>
-      <w:sz w:val="22"/>
+    <w:rPr>
       <w:color w:val="172033"/>
     </w:rPr>
   </w:style>
   <w:style w:type="paragraph" w:styleId="Title">
     <w:name w:val="Title"/>
     <w:basedOn w:val="Normal"/>
-    <w:next w:val="Subtitle"/>
     <w:qFormat/>
     <w:pPr>
       <w:keepNext/>
-      <w:spacing w:before="0" w:after="100"/>
-    </w:pPr>
-    <w:rPr>
-      <w:rFonts w:ascii="Calibri" w:hAnsi="Calibri"/>
+      <w:spacing w:after="100"/>
+    </w:pPr>
+    <w:rPr>
       <w:b/>
       <w:sz w:val="54"/>
-      <w:color w:val="172033"/>
     </w:rPr>
   </w:style>
   <w:style w:type="paragraph" w:styleId="Subtitle">
     <w:name w:val="Subtitle"/>
     <w:basedOn w:val="Normal"/>
-    <w:next w:val="Metadata"/>
-    <w:qFormat/>
     <w:pPr>
       <w:keepNext/>
-      <w:spacing w:before="0" w:after="240"/>
+      <w:spacing w:after="240"/>
     </w:pPr>
     <w:rPr>
       <w:sz w:val="26"/>
@@ -573,78 +772,39 @@
   <w:style w:type="paragraph" w:styleId="Kicker">
     <w:name w:val="Kicker"/>
     <w:basedOn w:val="Normal"/>
-    <w:next w:val="Title"/>
     <w:pPr>
       <w:keepNext/>
-      <w:spacing w:before="0" w:after="40"/>
+      <w:spacing w:after="40"/>
     </w:pPr>
     <w:rPr>
       <w:b/>
       <w:caps/>
       <w:sz w:val="19"/>
       <w:color w:val="355AF3"/>
-      <w:spacing w:val="24"/>
     </w:rPr>
   </w:style>
   <w:style w:type="paragraph" w:styleId="Heading1">
     <w:name w:val="heading 1"/>
     <w:basedOn w:val="Normal"/>
-    <w:next w:val="Normal"/>
     <w:qFormat/>
-    <w:uiPriority w:val="9"/>
     <w:pPr>
       <w:keepNext/>
       <w:keepLines/>
-      <w:pageBreakBefore w:val="0"/>
-      <w:spacing w:before="360" w:after="200"/>
+      <w:spacing w:before="300" w:after="160"/>
       <w:outlineLvl w:val="0"/>
     </w:pPr>
     <w:rPr>
       <w:b/>
       <w:sz w:val="32"/>
-      <w:color w:val="2E74B5"/>
-    </w:rPr>
-  </w:style>
-  <w:style w:type="paragraph" w:styleId="Heading2">
-    <w:name w:val="heading 2"/>
-    <w:basedOn w:val="Normal"/>
-    <w:next w:val="Normal"/>
-    <w:qFormat/>
-    <w:pPr>
-      <w:keepNext/>
-      <w:keepLines/>
-      <w:spacing w:before="280" w:after="140"/>
-      <w:outlineLvl w:val="1"/>
-    </w:pPr>
-    <w:rPr>
-      <w:b/>
-      <w:sz w:val="26"/>
-      <w:color w:val="2E74B5"/>
-    </w:rPr>
-  </w:style>
-  <w:style w:type="paragraph" w:styleId="Heading3">
-    <w:name w:val="heading 3"/>
-    <w:basedOn w:val="Normal"/>
-    <w:next w:val="Normal"/>
-    <w:qFormat/>
-    <w:pPr>
-      <w:keepNext/>
-      <w:keepLines/>
-      <w:spacing w:before="200" w:after="100"/>
-      <w:outlineLvl w:val="2"/>
-    </w:pPr>
-    <w:rPr>
-      <w:b/>
-      <w:sz w:val="24"/>
-      <w:color w:val="1F4D78"/>
+      <w:color w:val="2E5AAC"/>
     </w:rPr>
   </w:style>
   <w:style w:type="paragraph" w:styleId="ListBullet">
     <w:name w:val="List Bullet"/>
     <w:basedOn w:val="Normal"/>
     <w:pPr>
-      <w:spacing w:after="80" w:line="300" w:lineRule="auto"/>
       <w:ind w:left="540" w:hanging="270"/>
+      <w:spacing w:after="80"/>
     </w:pPr>
   </w:style>
   <w:style w:type="paragraph" w:styleId="Metadata">
@@ -652,7 +812,7 @@
     <w:basedOn w:val="Normal"/>
     <w:pPr>
       <w:keepNext/>
-      <w:spacing w:before="0" w:after="40"/>
+      <w:spacing w:after="40"/>
     </w:pPr>
     <w:rPr>
       <w:sz w:val="20"/>
@@ -663,7 +823,7 @@
     <w:name w:val="Disclaimer"/>
     <w:basedOn w:val="Normal"/>
     <w:pPr>
-      <w:spacing w:before="180" w:after="120"/>
+      <w:spacing w:before="180"/>
       <w:shd w:val="clear" w:fill="EEF2FF"/>
       <w:ind w:left="160" w:right="160"/>
     </w:pPr>
@@ -673,22 +833,49 @@
       <w:color w:val="3448A4"/>
     </w:rPr>
   </w:style>
+  <w:style w:type="paragraph" w:styleId="TOC1">
+    <w:name w:val="toc 1"/>
+    <w:basedOn w:val="Normal"/>
+    <w:pPr>
+      <w:ind w:left="240"/>
+      <w:spacing w:after="60"/>
+    </w:pPr>
+  </w:style>
   <w:style w:type="paragraph" w:styleId="Source">
     <w:name w:val="Source"/>
     <w:basedOn w:val="Normal"/>
-    <w:pPr>
-      <w:spacing w:before="80" w:after="80"/>
-    </w:pPr>
     <w:rPr>
       <w:sz w:val="20"/>
+    </w:rPr>
+  </w:style>
+  <w:style w:type="paragraph" w:styleId="TableCaption">
+    <w:name w:val="Table Caption"/>
+    <w:basedOn w:val="Normal"/>
+    <w:pPr>
+      <w:keepNext/>
+      <w:spacing w:before="120" w:after="80"/>
+    </w:pPr>
+    <w:rPr>
+      <w:b/>
+      <w:sz w:val="20"/>
+    </w:rPr>
+  </w:style>
+  <w:style w:type="paragraph" w:styleId="FigureCaption">
+    <w:name w:val="Figure Caption"/>
+    <w:basedOn w:val="Normal"/>
+    <w:pPr>
+      <w:jc w:val="center"/>
+      <w:spacing w:after="140"/>
+    </w:pPr>
+    <w:rPr>
+      <w:i/>
+      <w:sz w:val="19"/>
+      <w:color w:val="667085"/>
     </w:rPr>
   </w:style>
   <w:style w:type="paragraph" w:styleId="Header">
     <w:name w:val="header"/>
     <w:basedOn w:val="Normal"/>
-    <w:pPr>
-      <w:spacing w:before="0" w:after="0"/>
-    </w:pPr>
     <w:rPr>
       <w:sz w:val="17"/>
       <w:color w:val="98A2B3"/>
@@ -699,7 +886,6 @@
     <w:basedOn w:val="Normal"/>
     <w:pPr>
       <w:jc w:val="right"/>
-      <w:spacing w:before="0" w:after="0"/>
     </w:pPr>
     <w:rPr>
       <w:sz w:val="17"/>
@@ -708,7 +894,6 @@
   </w:style>
   <w:style w:type="character" w:styleId="Hyperlink">
     <w:name w:val="Hyperlink"/>
-    <w:unhideWhenUsed/>
     <w:rPr>
       <w:color w:val="355AF3"/>
       <w:u w:val="single"/>

</xml_diff>

<commit_message>
Fix DOCX styles and LibreOffice rendering
</commit_message>
<xml_diff>
--- a/Samples/Generated/Cours-complet-demo.docx
+++ b/Samples/Generated/Cours-complet-demo.docx
@@ -34,7 +34,7 @@
         <w:rPr>
           <w:b/>
         </w:rPr>
-        <w:t>Semestre : </w:t>
+        <w:t xml:space="preserve">Semestre : </w:t>
       </w:r>
       <w:r>
         <w:t>Semestre 1</w:t>
@@ -48,7 +48,7 @@
         <w:rPr>
           <w:b/>
         </w:rPr>
-        <w:t>UE : </w:t>
+        <w:t xml:space="preserve">UE : </w:t>
       </w:r>
       <w:r>
         <w:t>UE 2.1 - Biologie fondamentale</w:t>
@@ -62,7 +62,7 @@
         <w:rPr>
           <w:b/>
         </w:rPr>
-        <w:t>Cours : </w:t>
+        <w:t xml:space="preserve">Cours : </w:t>
       </w:r>
       <w:r>
         <w:t>La cellule et les tissus</w:t>
@@ -76,7 +76,7 @@
         <w:rPr>
           <w:b/>
         </w:rPr>
-        <w:t>Enseignant : </w:t>
+        <w:t xml:space="preserve">Enseignant : </w:t>
       </w:r>
       <w:r>
         <w:t>Dr Martin (exemple fictif)</w:t>
@@ -90,7 +90,7 @@
         <w:rPr>
           <w:b/>
         </w:rPr>
-        <w:t>Date : </w:t>
+        <w:t xml:space="preserve">Date : </w:t>
       </w:r>
       <w:r>
         <w:t>14/09/2026</w:t>
@@ -280,7 +280,7 @@
             <w:shd w:val="clear" w:fill="FDECEC"/>
           </w:tcPr>
           <w:p>
-            <w:hyperlink r:id="rId4">
+            <w:hyperlink r:id="rId7">
               <w:r>
                 <w:rPr>
                   <w:b/>
@@ -298,7 +298,6 @@
         </w:tc>
       </w:tr>
     </w:tbl>
-    <w:p/>
     <w:p>
       <w:pPr>
         <w:pStyle w:val="Heading1"/>
@@ -473,7 +472,11 @@
         </w:tc>
       </w:tr>
     </w:tbl>
-    <w:p/>
+    <w:p>
+      <w:pPr>
+        <w:spacing w:before="0" w:after="80"/>
+      </w:pPr>
+    </w:p>
     <w:p>
       <w:pPr>
         <w:pStyle w:val="ListBullet"/>
@@ -541,7 +544,7 @@
             <w:shd w:val="clear" w:fill="FFF8E1"/>
           </w:tcPr>
           <w:p>
-            <w:hyperlink r:id="rId5">
+            <w:hyperlink r:id="rId8">
               <w:r>
                 <w:rPr>
                   <w:b/>
@@ -559,7 +562,6 @@
         </w:tc>
       </w:tr>
     </w:tbl>
-    <w:p/>
     <w:p>
       <w:pPr>
         <w:pStyle w:val="Heading1"/>
@@ -625,7 +627,6 @@
         </w:tc>
       </w:tr>
     </w:tbl>
-    <w:p/>
     <w:p>
       <w:pPr>
         <w:pStyle w:val="Heading1"/>
@@ -646,7 +647,7 @@
         </w:rPr>
         <w:t>Organisation mondiale de la Santé (démonstration du format) — </w:t>
       </w:r>
-      <w:hyperlink r:id="rId3">
+      <w:hyperlink r:id="rId6">
         <w:r>
           <w:rPr>
             <w:rStyle w:val="Hyperlink"/>

</xml_diff>